<commit_message>
updated due date of hw2
</commit_message>
<xml_diff>
--- a/HW/hw02-jupyter-pandas/HW2.docx
+++ b/HW/hw02-jupyter-pandas/HW2.docx
@@ -110,6 +110,7 @@
         <w:jc w:val="center"/>
         <w:rPr>
           <w:b/>
+          <w:color w:val="EE0000"/>
         </w:rPr>
       </w:pPr>
       <w:r>
@@ -128,6 +129,7 @@
       <w:r>
         <w:rPr>
           <w:b/>
+          <w:strike/>
         </w:rPr>
         <w:t>Sep</w:t>
       </w:r>
@@ -135,14 +137,36 @@
       <w:r>
         <w:rPr>
           <w:b/>
+          <w:strike/>
         </w:rPr>
         <w:t xml:space="preserve"> </w:t>
       </w:r>
       <w:r>
         <w:rPr>
           <w:b/>
+          <w:strike/>
         </w:rPr>
         <w:t>8</w:t>
+      </w:r>
+      <w:r>
+        <w:rPr>
+          <w:b/>
+          <w:strike/>
+        </w:rPr>
+        <w:t xml:space="preserve"> </w:t>
+      </w:r>
+      <w:r>
+        <w:rPr>
+          <w:b/>
+        </w:rPr>
+        <w:t xml:space="preserve">  </w:t>
+      </w:r>
+      <w:r>
+        <w:rPr>
+          <w:b/>
+          <w:color w:val="EE0000"/>
+        </w:rPr>
+        <w:t>Sep 9 at 1000</w:t>
       </w:r>
     </w:p>
     <w:p>
@@ -3767,6 +3791,7 @@
   <w:style w:type="character" w:default="1" w:styleId="DefaultParagraphFont">
     <w:name w:val="Default Paragraph Font"/>
     <w:uiPriority w:val="1"/>
+    <w:semiHidden/>
     <w:unhideWhenUsed/>
   </w:style>
   <w:style w:type="table" w:default="1" w:styleId="TableNormal">

</xml_diff>

<commit_message>
hw02 restored to original
</commit_message>
<xml_diff>
--- a/HW/hw02-jupyter-pandas/HW2.docx
+++ b/HW/hw02-jupyter-pandas/HW2.docx
@@ -129,7 +129,6 @@
       <w:r>
         <w:rPr>
           <w:b/>
-          <w:strike/>
         </w:rPr>
         <w:t>Sep</w:t>
       </w:r>
@@ -137,36 +136,14 @@
       <w:r>
         <w:rPr>
           <w:b/>
-          <w:strike/>
         </w:rPr>
         <w:t xml:space="preserve"> </w:t>
       </w:r>
       <w:r>
         <w:rPr>
           <w:b/>
-          <w:strike/>
         </w:rPr>
         <w:t>8</w:t>
-      </w:r>
-      <w:r>
-        <w:rPr>
-          <w:b/>
-          <w:strike/>
-        </w:rPr>
-        <w:t xml:space="preserve"> </w:t>
-      </w:r>
-      <w:r>
-        <w:rPr>
-          <w:b/>
-        </w:rPr>
-        <w:t xml:space="preserve">  </w:t>
-      </w:r>
-      <w:r>
-        <w:rPr>
-          <w:b/>
-          <w:color w:val="EE0000"/>
-        </w:rPr>
-        <w:t>Sep 9 at 1000</w:t>
       </w:r>
     </w:p>
     <w:p>

</xml_diff>

<commit_message>
hw02  last change, due Th 9/10
</commit_message>
<xml_diff>
--- a/HW/hw02-jupyter-pandas/HW2.docx
+++ b/HW/hw02-jupyter-pandas/HW2.docx
@@ -117,33 +117,50 @@
         <w:rPr>
           <w:b/>
         </w:rPr>
-        <w:t>Due</w:t>
+        <w:t xml:space="preserve">Due:  </w:t>
+      </w:r>
+      <w:r>
+        <w:rPr>
+          <w:b/>
+          <w:strike/>
+        </w:rPr>
+        <w:t>Sep</w:t>
+      </w:r>
+      <w:r>
+        <w:rPr>
+          <w:b/>
+          <w:strike/>
+        </w:rPr>
+        <w:t xml:space="preserve"> </w:t>
       </w:r>
       <w:proofErr w:type="gramStart"/>
       <w:r>
         <w:rPr>
           <w:b/>
-        </w:rPr>
-        <w:t xml:space="preserve">:  </w:t>
-      </w:r>
-      <w:r>
-        <w:rPr>
-          <w:b/>
-        </w:rPr>
-        <w:t>Sep</w:t>
+          <w:strike/>
+        </w:rPr>
+        <w:t>8</w:t>
+      </w:r>
+      <w:r>
+        <w:rPr>
+          <w:b/>
+        </w:rPr>
+        <w:t xml:space="preserve">  </w:t>
+      </w:r>
+      <w:r>
+        <w:rPr>
+          <w:b/>
+          <w:color w:val="EE0000"/>
+        </w:rPr>
+        <w:t>TH</w:t>
       </w:r>
       <w:proofErr w:type="gramEnd"/>
       <w:r>
         <w:rPr>
           <w:b/>
-        </w:rPr>
-        <w:t xml:space="preserve"> </w:t>
-      </w:r>
-      <w:r>
-        <w:rPr>
-          <w:b/>
-        </w:rPr>
-        <w:t>8</w:t>
+          <w:color w:val="EE0000"/>
+        </w:rPr>
+        <w:t xml:space="preserve"> SEP 10 at 1300</w:t>
       </w:r>
     </w:p>
     <w:p>

</xml_diff>